<commit_message>
Invite: vriendelijke errors + hergebruik bestaand account
- Check eerst of e-mail al een profile heeft → skip invite, gebruik bestaand userId
- friendlyAuthError() vertaalt Supabase-errors naar mensentaal (already registered, rate limit, invalid email)
- Toast toont nu ook de detail-reden zodat de echte oorzaak zichtbaar is

Co-Authored-By: claude-flow <ruv@ruv.net>
</commit_message>
<xml_diff>
--- a/Offerte-Wittenboer-SolidMotion.docx
+++ b/Offerte-Wittenboer-SolidMotion.docx
@@ -782,7 +782,7 @@
     </w:p>
     <w:p>
       <w:pPr>
-        <w:spacing w:after="220" w:before="0" w:line="300"/>
+        <w:spacing w:after="140" w:before="0" w:line="300"/>
         <w:jc w:val="left"/>
       </w:pPr>
       <w:r>
@@ -796,7 +796,26 @@
           <w:sz w:val="22"/>
           <w:szCs w:val="22"/>
         </w:rPr>
-        <w:t xml:space="preserve">Belangrijk: dit is een vriendenprijs. Vergelijkbaar werk binnen SolidMotion ligt rond de € 9.000. Voor Wittenboer Events staat de totale investering op € 2.950 exclusief BTW. In de tabel verderop zie je per module beide tarieven, zodat helder is wat de waarde is.</w:t>
+        <w:t xml:space="preserve">Belangrijk: dit is een vriendenprijs. Vergelijkbaar werk binnen SolidMotion ligt rond de € 9.000. Voor Wittenboer Events staat de totale investering op € 1.950 exclusief BTW. In de tabel verderop zie je per module beide tarieven, zodat helder is wat de waarde is.</w:t>
+      </w:r>
+    </w:p>
+    <w:p>
+      <w:pPr>
+        <w:spacing w:after="220" w:before="0" w:line="300"/>
+        <w:jc w:val="left"/>
+      </w:pPr>
+      <w:r>
+        <w:rPr>
+          <w:rFonts w:ascii="Arial" w:cs="Arial" w:eastAsia="Arial" w:hAnsi="Arial"/>
+          <w:b w:val="false"/>
+          <w:bCs w:val="false"/>
+          <w:i w:val="false"/>
+          <w:iCs w:val="false"/>
+          <w:color w:val="2A2A2A"/>
+          <w:sz w:val="22"/>
+          <w:szCs w:val="22"/>
+        </w:rPr>
+        <w:t xml:space="preserve">Voor mij zit het voordeel niet alleen in de samenwerking, maar ook in de ruimte om dit traject te gebruiken om mijn proces en aanpak verder te verbeteren. Win-win: jij krijgt een serieus systeem voor een vriendentarief, en ik krijg een echte productie-case om op verder te bouwen.</w:t>
       </w:r>
     </w:p>
     <w:p>
@@ -2083,7 +2102,7 @@
                 <w:sz w:val="20"/>
                 <w:szCs w:val="20"/>
               </w:rPr>
-              <w:t xml:space="preserve">€ 250</w:t>
+              <w:t xml:space="preserve">€ 175</w:t>
             </w:r>
           </w:p>
         </w:tc>
@@ -2233,7 +2252,7 @@
                 <w:sz w:val="20"/>
                 <w:szCs w:val="20"/>
               </w:rPr>
-              <w:t xml:space="preserve">€ 600</w:t>
+              <w:t xml:space="preserve">€ 375</w:t>
             </w:r>
           </w:p>
         </w:tc>
@@ -2383,7 +2402,7 @@
                 <w:sz w:val="20"/>
                 <w:szCs w:val="20"/>
               </w:rPr>
-              <w:t xml:space="preserve">€ 400</w:t>
+              <w:t xml:space="preserve">€ 250</w:t>
             </w:r>
           </w:p>
         </w:tc>
@@ -2533,7 +2552,7 @@
                 <w:sz w:val="20"/>
                 <w:szCs w:val="20"/>
               </w:rPr>
-              <w:t xml:space="preserve">€ 350</w:t>
+              <w:t xml:space="preserve">€ 225</w:t>
             </w:r>
           </w:p>
         </w:tc>
@@ -2683,7 +2702,7 @@
                 <w:sz w:val="20"/>
                 <w:szCs w:val="20"/>
               </w:rPr>
-              <w:t xml:space="preserve">€ 250</w:t>
+              <w:t xml:space="preserve">€ 175</w:t>
             </w:r>
           </w:p>
         </w:tc>
@@ -2833,7 +2852,7 @@
                 <w:sz w:val="20"/>
                 <w:szCs w:val="20"/>
               </w:rPr>
-              <w:t xml:space="preserve">€ 350</w:t>
+              <w:t xml:space="preserve">€ 200</w:t>
             </w:r>
           </w:p>
         </w:tc>
@@ -2983,7 +3002,7 @@
                 <w:sz w:val="20"/>
                 <w:szCs w:val="20"/>
               </w:rPr>
-              <w:t xml:space="preserve">€ 200</w:t>
+              <w:t xml:space="preserve">€ 125</w:t>
             </w:r>
           </w:p>
         </w:tc>
@@ -3133,7 +3152,7 @@
                 <w:sz w:val="20"/>
                 <w:szCs w:val="20"/>
               </w:rPr>
-              <w:t xml:space="preserve">€ 200</w:t>
+              <w:t xml:space="preserve">€ 125</w:t>
             </w:r>
           </w:p>
         </w:tc>
@@ -3283,7 +3302,7 @@
                 <w:sz w:val="20"/>
                 <w:szCs w:val="20"/>
               </w:rPr>
-              <w:t xml:space="preserve">€ 200</w:t>
+              <w:t xml:space="preserve">€ 125</w:t>
             </w:r>
           </w:p>
         </w:tc>
@@ -3433,7 +3452,7 @@
                 <w:sz w:val="20"/>
                 <w:szCs w:val="20"/>
               </w:rPr>
-              <w:t xml:space="preserve">€ 100</w:t>
+              <w:t xml:space="preserve">€ 75</w:t>
             </w:r>
           </w:p>
         </w:tc>
@@ -3583,7 +3602,7 @@
                 <w:sz w:val="20"/>
                 <w:szCs w:val="20"/>
               </w:rPr>
-              <w:t xml:space="preserve">€ 150</w:t>
+              <w:t xml:space="preserve">€ 100</w:t>
             </w:r>
           </w:p>
         </w:tc>
@@ -3737,7 +3756,7 @@
                 <w:sz w:val="22"/>
                 <w:szCs w:val="22"/>
               </w:rPr>
-              <w:t xml:space="preserve">€ 2.950</w:t>
+              <w:t xml:space="preserve">€ 1.950</w:t>
             </w:r>
           </w:p>
         </w:tc>
@@ -4105,6 +4124,43 @@
             <w:r>
               <w:rPr>
                 <w:rFonts w:ascii="Arial" w:cs="Arial" w:eastAsia="Arial" w:hAnsi="Arial"/>
+                <w:b/>
+                <w:bCs/>
+                <w:i w:val="false"/>
+                <w:iCs w:val="false"/>
+                <w:color w:val="0A0A0A"/>
+                <w:sz w:val="20"/>
+                <w:szCs w:val="20"/>
+              </w:rPr>
+              <w:t xml:space="preserve">Onderhoudscontract (aanbevolen) — kleine aanpassingen, monitoring, support</w:t>
+            </w:r>
+          </w:p>
+        </w:tc>
+        <w:tc>
+          <w:tcPr>
+            <w:tcW w:type="dxa" w:w="2340"/>
+            <w:tcBorders>
+              <w:top w:val="single" w:color="E5E5E5" w:sz="4"/>
+              <w:left w:val="single" w:color="E5E5E5" w:sz="4"/>
+              <w:bottom w:val="single" w:color="E5E5E5" w:sz="4"/>
+              <w:right w:val="single" w:color="E5E5E5" w:sz="4"/>
+            </w:tcBorders>
+            <w:tcMar>
+              <w:top w:type="dxa" w:w="100"/>
+              <w:left w:type="dxa" w:w="140"/>
+              <w:bottom w:type="dxa" w:w="100"/>
+              <w:right w:type="dxa" w:w="140"/>
+            </w:tcMar>
+            <w:vAlign w:val="center"/>
+          </w:tcPr>
+          <w:p>
+            <w:pPr>
+              <w:spacing w:after="0" w:line="280"/>
+              <w:jc w:val="left"/>
+            </w:pPr>
+            <w:r>
+              <w:rPr>
+                <w:rFonts w:ascii="Arial" w:cs="Arial" w:eastAsia="Arial" w:hAnsi="Arial"/>
                 <w:b w:val="false"/>
                 <w:bCs w:val="false"/>
                 <w:i w:val="false"/>
@@ -4113,7 +4169,7 @@
                 <w:sz w:val="20"/>
                 <w:szCs w:val="20"/>
               </w:rPr>
-              <w:t xml:space="preserve">Optioneel onderhoudscontract (kleine aanpassingen, monitoring)</w:t>
+              <w:t xml:space="preserve">per maand</w:t>
             </w:r>
           </w:p>
         </w:tc>
@@ -4137,53 +4193,16 @@
           <w:p>
             <w:pPr>
               <w:spacing w:after="0" w:line="280"/>
-              <w:jc w:val="left"/>
-            </w:pPr>
-            <w:r>
-              <w:rPr>
-                <w:rFonts w:ascii="Arial" w:cs="Arial" w:eastAsia="Arial" w:hAnsi="Arial"/>
-                <w:b w:val="false"/>
-                <w:bCs w:val="false"/>
-                <w:i w:val="false"/>
-                <w:iCs w:val="false"/>
-                <w:color w:val="2A2A2A"/>
-                <w:sz w:val="20"/>
-                <w:szCs w:val="20"/>
-              </w:rPr>
-              <w:t xml:space="preserve">per maand</w:t>
-            </w:r>
-          </w:p>
-        </w:tc>
-        <w:tc>
-          <w:tcPr>
-            <w:tcW w:type="dxa" w:w="2340"/>
-            <w:tcBorders>
-              <w:top w:val="single" w:color="E5E5E5" w:sz="4"/>
-              <w:left w:val="single" w:color="E5E5E5" w:sz="4"/>
-              <w:bottom w:val="single" w:color="E5E5E5" w:sz="4"/>
-              <w:right w:val="single" w:color="E5E5E5" w:sz="4"/>
-            </w:tcBorders>
-            <w:tcMar>
-              <w:top w:type="dxa" w:w="100"/>
-              <w:left w:type="dxa" w:w="140"/>
-              <w:bottom w:type="dxa" w:w="100"/>
-              <w:right w:type="dxa" w:w="140"/>
-            </w:tcMar>
-            <w:vAlign w:val="center"/>
-          </w:tcPr>
-          <w:p>
-            <w:pPr>
-              <w:spacing w:after="0" w:line="280"/>
               <w:jc w:val="right"/>
             </w:pPr>
             <w:r>
               <w:rPr>
                 <w:rFonts w:ascii="Arial" w:cs="Arial" w:eastAsia="Arial" w:hAnsi="Arial"/>
-                <w:b w:val="false"/>
-                <w:bCs w:val="false"/>
-                <w:i w:val="false"/>
-                <w:iCs w:val="false"/>
-                <w:color w:val="2A2A2A"/>
+                <w:b/>
+                <w:bCs/>
+                <w:i w:val="false"/>
+                <w:iCs w:val="false"/>
+                <w:color w:val="0A0A0A"/>
                 <w:sz w:val="20"/>
                 <w:szCs w:val="20"/>
               </w:rPr>
@@ -4335,7 +4354,7 @@
           <w:sz w:val="22"/>
           <w:szCs w:val="22"/>
         </w:rPr>
-        <w:t xml:space="preserve">Het onderhoudscontract is optioneel en maandelijks opzegbaar. Zonder contract betaal je per uur wanneer er iets aangepast moet worden.</w:t>
+        <w:t xml:space="preserve">Het onderhoudscontract is aanbevolen, maandelijks opzegbaar en bevat support, kleine aanpassingen en monitoring. Zonder contract betaal je per uur wanneer er iets aangepast moet worden.</w:t>
       </w:r>
     </w:p>
     <w:p>
@@ -4605,7 +4624,7 @@
                 <w:sz w:val="20"/>
                 <w:szCs w:val="20"/>
               </w:rPr>
-              <w:t xml:space="preserve">€ 2.950,00</w:t>
+              <w:t xml:space="preserve">€ 1.950,00</w:t>
             </w:r>
           </w:p>
         </w:tc>
@@ -4681,7 +4700,7 @@
                 <w:sz w:val="20"/>
                 <w:szCs w:val="20"/>
               </w:rPr>
-              <w:t xml:space="preserve">€ 620,00</w:t>
+              <w:t xml:space="preserve">€ 410,00</w:t>
             </w:r>
           </w:p>
         </w:tc>
@@ -4759,7 +4778,7 @@
                 <w:sz w:val="22"/>
                 <w:szCs w:val="22"/>
               </w:rPr>
-              <w:t xml:space="preserve">€ 3.570,00</w:t>
+              <w:t xml:space="preserve">€ 2.360,00</w:t>
             </w:r>
           </w:p>
         </w:tc>
@@ -5012,7 +5031,7 @@
           <w:sz w:val="22"/>
           <w:szCs w:val="22"/>
         </w:rPr>
-        <w:t xml:space="preserve">Met deze offerte wordt opdracht gegeven aan SolidMotion tot het bouwen van een nieuwe website inclusief boekingen-systeem, ArtwinLive-koppeling en show-pakketten brochure voor Wittenboer Events, voor een vaste vriendenprijs van € 2.950,00 exclusief BTW.</w:t>
+        <w:t xml:space="preserve">Met deze offerte wordt opdracht gegeven aan SolidMotion tot het bouwen van een nieuwe website inclusief boekingen-systeem, ArtwinLive-koppeling en show-pakketten brochure voor Wittenboer Events, voor een vaste vriendenprijs van € 1.950,00 exclusief BTW.</w:t>
       </w:r>
     </w:p>
     <w:tbl>

</xml_diff>